<commit_message>
Update version and commit references after rebasing onto 1.1.8
Co-Authored-By: Claude Opus 5.5 <noreply@anthropic.com>
</commit_message>
<xml_diff>
--- a/docs/review/response-domain-review/SedSAT3_domain_review_response.docx
+++ b/docs/review/response-domain-review/SedSAT3_domain_review_response.docx
@@ -161,7 +161,7 @@
           <w:rFonts w:ascii="Consolas" w:hAnsi="Consolas" w:cs="Consolas"/>
           <w:sz w:val="19"/>
         </w:rPr>
-        <w:t xml:space="preserve">619f0a6</w:t>
+        <w:t xml:space="preserve">d7d8b92</w:t>
       </w:r>
       <w:r>
         <w:t xml:space="preserve">, </w:t>
@@ -171,7 +171,7 @@
           <w:rFonts w:ascii="Consolas" w:hAnsi="Consolas" w:cs="Consolas"/>
           <w:sz w:val="19"/>
         </w:rPr>
-        <w:t xml:space="preserve">d0acec7</w:t>
+        <w:t xml:space="preserve">8708c20</w:t>
       </w:r>
       <w:r>
         <w:t xml:space="preserve">, </w:t>
@@ -181,7 +181,7 @@
           <w:rFonts w:ascii="Consolas" w:hAnsi="Consolas" w:cs="Consolas"/>
           <w:sz w:val="19"/>
         </w:rPr>
-        <w:t xml:space="preserve">839772d</w:t>
+        <w:t xml:space="preserve">ae2e4d5</w:t>
       </w:r>
       <w:r>
         <w:t xml:space="preserve"> and the manual commits.</w:t>
@@ -556,7 +556,7 @@
           <w:rFonts w:ascii="Consolas" w:hAnsi="Consolas" w:cs="Consolas"/>
           <w:sz w:val="19"/>
         </w:rPr>
-        <w:t xml:space="preserve">619f0a6</w:t>
+        <w:t xml:space="preserve">d7d8b92</w:t>
       </w:r>
       <w:r>
         <w:t xml:space="preserve">).</w:t>
@@ -716,7 +716,7 @@
           <w:rFonts w:ascii="Consolas" w:hAnsi="Consolas" w:cs="Consolas"/>
           <w:sz w:val="19"/>
         </w:rPr>
-        <w:t xml:space="preserve">619f0a6</w:t>
+        <w:t xml:space="preserve">d7d8b92</w:t>
       </w:r>
       <w:r>
         <w:t xml:space="preserve">).</w:t>
@@ -779,7 +779,7 @@
           <w:rFonts w:ascii="Consolas" w:hAnsi="Consolas" w:cs="Consolas"/>
           <w:sz w:val="19"/>
         </w:rPr>
-        <w:t xml:space="preserve">d0acec7</w:t>
+        <w:t xml:space="preserve">8708c20</w:t>
       </w:r>
       <w:r>
         <w:t xml:space="preserve">).</w:t>
@@ -891,7 +891,7 @@
           <w:rFonts w:ascii="Consolas" w:hAnsi="Consolas" w:cs="Consolas"/>
           <w:sz w:val="19"/>
         </w:rPr>
-        <w:t xml:space="preserve">619f0a6</w:t>
+        <w:t xml:space="preserve">d7d8b92</w:t>
       </w:r>
       <w:r>
         <w:t xml:space="preserve">).</w:t>
@@ -1674,7 +1674,7 @@
           <w:rFonts w:ascii="Consolas" w:hAnsi="Consolas" w:cs="Consolas"/>
           <w:sz w:val="19"/>
         </w:rPr>
-        <w:t xml:space="preserve">619f0a6</w:t>
+        <w:t xml:space="preserve">d7d8b92</w:t>
       </w:r>
       <w:r>
         <w:t xml:space="preserve">, </w:t>
@@ -1684,7 +1684,7 @@
           <w:rFonts w:ascii="Consolas" w:hAnsi="Consolas" w:cs="Consolas"/>
           <w:sz w:val="19"/>
         </w:rPr>
-        <w:t xml:space="preserve">d0acec7</w:t>
+        <w:t xml:space="preserve">8708c20</w:t>
       </w:r>
       <w:r>
         <w:t xml:space="preserve">).</w:t>
@@ -1759,7 +1759,7 @@
           <w:rFonts w:ascii="Consolas" w:hAnsi="Consolas" w:cs="Consolas"/>
           <w:sz w:val="19"/>
         </w:rPr>
-        <w:t xml:space="preserve">839772d</w:t>
+        <w:t xml:space="preserve">ae2e4d5</w:t>
       </w:r>
       <w:r>
         <w:t xml:space="preserve">).</w:t>
@@ -2282,7 +2282,7 @@
         <w:t xml:space="preserve">Response. </w:t>
       </w:r>
       <w:r>
-        <w:t xml:space="preserve">The title page now gives the software version, 1.1.7, and the date as a placeholder until publication. The manual now also has a list of figures after the table of contents. </w:t>
+        <w:t xml:space="preserve">The title page now gives the software version, 1.1.8, and the date as a placeholder until publication. The manual now also has a list of figures after the table of contents. </w:t>
       </w:r>
       <w:r>
         <w:rPr>
@@ -2789,7 +2789,7 @@
           <w:rFonts w:ascii="Consolas" w:hAnsi="Consolas" w:cs="Consolas"/>
           <w:sz w:val="19"/>
         </w:rPr>
-        <w:t xml:space="preserve">619f0a6</w:t>
+        <w:t xml:space="preserve">d7d8b92</w:t>
       </w:r>
       <w:r>
         <w:t xml:space="preserve">). The </w:t>
@@ -3029,7 +3029,7 @@
           <w:rFonts w:ascii="Consolas" w:hAnsi="Consolas" w:cs="Consolas"/>
           <w:sz w:val="19"/>
         </w:rPr>
-        <w:t xml:space="preserve">619f0a6</w:t>
+        <w:t xml:space="preserve">d7d8b92</w:t>
       </w:r>
       <w:r>
         <w:t xml:space="preserve">).</w:t>
@@ -3439,7 +3439,7 @@
           <w:rFonts w:ascii="Consolas" w:hAnsi="Consolas" w:cs="Consolas"/>
           <w:sz w:val="19"/>
         </w:rPr>
-        <w:t xml:space="preserve">619f0a6</w:t>
+        <w:t xml:space="preserve">d7d8b92</w:t>
       </w:r>
       <w:r>
         <w:t xml:space="preserve">).</w:t>
@@ -4109,7 +4109,7 @@
           <w:rFonts w:ascii="Consolas" w:hAnsi="Consolas" w:cs="Consolas"/>
           <w:sz w:val="19"/>
         </w:rPr>
-        <w:t xml:space="preserve">619f0a6</w:t>
+        <w:t xml:space="preserve">d7d8b92</w:t>
       </w:r>
       <w:r>
         <w:t xml:space="preserve">).</w:t>
@@ -4239,7 +4239,7 @@
           <w:rFonts w:ascii="Consolas" w:hAnsi="Consolas" w:cs="Consolas"/>
           <w:sz w:val="19"/>
         </w:rPr>
-        <w:t xml:space="preserve">619f0a6</w:t>
+        <w:t xml:space="preserve">d7d8b92</w:t>
       </w:r>
       <w:r>
         <w:t xml:space="preserve">).</w:t>
@@ -4557,7 +4557,7 @@
           <w:rFonts w:ascii="Consolas" w:hAnsi="Consolas" w:cs="Consolas"/>
           <w:sz w:val="19"/>
         </w:rPr>
-        <w:t xml:space="preserve">619f0a6</w:t>
+        <w:t xml:space="preserve">d7d8b92</w:t>
       </w:r>
       <w:r>
         <w:t xml:space="preserve">).</w:t>
@@ -4920,7 +4920,7 @@
           <w:rFonts w:ascii="Consolas" w:hAnsi="Consolas" w:cs="Consolas"/>
           <w:sz w:val="19"/>
         </w:rPr>
-        <w:t xml:space="preserve">619f0a6</w:t>
+        <w:t xml:space="preserve">d7d8b92</w:t>
       </w:r>
       <w:r>
         <w:t xml:space="preserve">).</w:t>
@@ -5016,7 +5016,7 @@
           <w:rFonts w:ascii="Consolas" w:hAnsi="Consolas" w:cs="Consolas"/>
           <w:sz w:val="19"/>
         </w:rPr>
-        <w:t xml:space="preserve">619f0a6</w:t>
+        <w:t xml:space="preserve">d7d8b92</w:t>
       </w:r>
       <w:r>
         <w:t xml:space="preserve">).</w:t>
@@ -5569,7 +5569,7 @@
           <w:rFonts w:ascii="Consolas" w:hAnsi="Consolas" w:cs="Consolas"/>
           <w:sz w:val="19"/>
         </w:rPr>
-        <w:t xml:space="preserve">619f0a6</w:t>
+        <w:t xml:space="preserve">d7d8b92</w:t>
       </w:r>
       <w:r>
         <w:t xml:space="preserve">, </w:t>
@@ -5579,7 +5579,7 @@
           <w:rFonts w:ascii="Consolas" w:hAnsi="Consolas" w:cs="Consolas"/>
           <w:sz w:val="19"/>
         </w:rPr>
-        <w:t xml:space="preserve">839772d</w:t>
+        <w:t xml:space="preserve">ae2e4d5</w:t>
       </w:r>
       <w:r>
         <w:t xml:space="preserve">).</w:t>

</xml_diff>

<commit_message>
Manual: TOC as the delta 13C base element in the example
Section 2.1 gives the base elements and standard ratios of both isotopes in
the example data (N for delta 15N, TOC for delta 13C) and explains how TOC is
used as a base element without being a tracer. Fingerprinting figures and
the constituent table regenerated with TOC as the base. The response to the
domain review marks the item done.

Co-Authored-By: Claude Opus 5.5 <noreply@anthropic.com>
</commit_message>
<xml_diff>
--- a/docs/review/response-domain-review/SedSAT3_domain_review_response.docx
+++ b/docs/review/response-domain-review/SedSAT3_domain_review_response.docx
@@ -2938,14 +2938,17 @@
         <w:t xml:space="preserve">Response. </w:t>
       </w:r>
       <w:r>
-        <w:t xml:space="preserve">The manual now says to set the type first, and links to the stable isotope section. It also says that the base element must be included in the analysis. The N15 values are given. For C13, I need to check the example’s base element before stating it: the test project uses Calcium with 0.011113, but the base element for δ¹³C should be the carbon content. </w:t>
-      </w:r>
-      <w:r>
-        <w:rPr>
-          <w:b/>
-          <w:color w:val="1446AA"/>
-        </w:rPr>
-        <w:t xml:space="preserve">[Arash: settle the base element and standard ratio for C13 in the example (TOC cannot be both the organic matter constituent and a base element), and state them in Section 2.1.]</w:t>
+        <w:t xml:space="preserve">The manual now says to set the type first, and links to the stable isotope section. It also says that the base element must be included in the analysis. Both are now given in Section 2.1: N for N15 (ratio 0.003676) and TOC for C13 (ratio 0.011180, VPDB). TOC is the only carbon content measured, but it is also the organic matter constituent, and the program did not accept that as a base element. It now does. TOC is not used as a tracer. Fingerprinting uses it only to weight each source’s δ¹³C by its organic carbon content, with or without the size and organic matter correction (</w:t>
+      </w:r>
+      <w:r>
+        <w:rPr>
+          <w:rFonts w:ascii="Consolas" w:hAnsi="Consolas" w:cs="Consolas"/>
+          <w:sz w:val="19"/>
+        </w:rPr>
+        <w:t xml:space="preserve">cdf856c</w:t>
+      </w:r>
+      <w:r>
+        <w:t xml:space="preserve">). The test project had used Calcium, which was not chemically meaningful. The standard ratio cancels in the mixture’s δ value, so its exact value does not change the results.</w:t>
       </w:r>
     </w:p>
     <w:p>
@@ -2957,7 +2960,7 @@
         <w:t xml:space="preserve">Status: </w:t>
       </w:r>
       <w:r>
-        <w:t xml:space="preserve">Done except the C13 values.</w:t>
+        <w:t xml:space="preserve">Done.</w:t>
       </w:r>
     </w:p>
     <w:p>
@@ -6188,54 +6191,6 @@
               <w:pStyle w:val="TableText"/>
             </w:pPr>
             <w:r>
-              <w:t xml:space="preserve">C13 base element and ratio in the example</w:t>
-            </w:r>
-          </w:p>
-        </w:tc>
-        <w:tc>
-          <w:tcPr>
-            <w:tcW w:w="970" w:type="dxa"/>
-          </w:tcPr>
-          <w:p>
-            <w:pPr>
-              <w:pStyle w:val="TableText"/>
-            </w:pPr>
-            <w:r>
-              <w:rPr>
-                <w:b/>
-                <w:color w:val="1446AA"/>
-              </w:rPr>
-              <w:t xml:space="preserve">[Arash: Arash]</w:t>
-            </w:r>
-          </w:p>
-        </w:tc>
-        <w:tc>
-          <w:tcPr>
-            <w:tcW w:w="4854" w:type="dxa"/>
-          </w:tcPr>
-          <w:p>
-            <w:pPr>
-              <w:pStyle w:val="TableText"/>
-            </w:pPr>
-            <w:r>
-              <w:t xml:space="preserve">State them in Section 2.1.</w:t>
-            </w:r>
-          </w:p>
-        </w:tc>
-      </w:tr>
-      <w:tr>
-        <w:trPr>
-          <w:cantSplit/>
-        </w:trPr>
-        <w:tc>
-          <w:tcPr>
-            <w:tcW w:w="3536" w:type="dxa"/>
-          </w:tcPr>
-          <w:p>
-            <w:pPr>
-              <w:pStyle w:val="TableText"/>
-            </w:pPr>
-            <w:r>
               <w:t xml:space="preserve">Screenshots to retake</w:t>
             </w:r>
           </w:p>

</xml_diff>

<commit_message>
Manual: compare each method with Sed_SAT 1.0
Table 1.1 now compares every SedSAT3 method with Sed_SAT 1.0, from the
Sed_SAT 1.0 source code (doi:10.5066/F76Q1VBX) and its report: non-detect
imputation (not in SedSAT3), the outlier transform, sequential vs joint size
and organic matter correction, the bracket tolerance, stepwise DFA with
weighting factors and a confusion matrix, isotopes mixed as plain tracers,
the relative-error mixing model, and the drop-one Monte Carlo. The response
to the domain review asks Allen and Lilly to check it.

Co-Authored-By: Claude Opus 5.5 <noreply@anthropic.com>
</commit_message>
<xml_diff>
--- a/docs/review/response-domain-review/SedSAT3_domain_review_response.docx
+++ b/docs/review/response-domain-review/SedSAT3_domain_review_response.docx
@@ -2018,14 +2018,67 @@
         <w:t xml:space="preserve">Response. </w:t>
       </w:r>
       <w:r>
-        <w:t xml:space="preserve">Added Table 1.1, “Methods in SedSAT3” (Section 1.2), listing every method and where it is described. Its last column, comparing each method with Sed_SAT 1.0, is left for you and Allen, who know Sed_SAT 1.0 best. </w:t>
-      </w:r>
-      <w:r>
-        <w:rPr>
-          <w:b/>
-          <w:color w:val="BE1E1E"/>
-        </w:rPr>
-        <w:t xml:space="preserve">[Allen, Lilly: fill in the comparison column.]</w:t>
+        <w:t xml:space="preserve">Added Table 1.1, “Methods in SedSAT3” (Section 1.2). For each method it gives SedSAT3’s approach, where the manual describes it, and how it compares with Sed_SAT 1.0: the same, changed, new, or not in SedSAT3. I wrote the comparison from the Sed_SAT 1.0 source code (the software release, doi:10.5066/F76Q1VBX) and its report. Please check it, since you know Sed_SAT 1.0 best.</w:t>
+      </w:r>
+    </w:p>
+    <w:p>
+      <w:pPr/>
+      <w:r>
+        <w:t xml:space="preserve">The comparison shows four things Sed_SAT 1.0 did that SedSAT3 does not:</w:t>
+      </w:r>
+    </w:p>
+    <w:p>
+      <w:pPr>
+        <w:pStyle w:val="ListBullet"/>
+        <w:numPr>
+          <w:ilvl w:val="0"/>
+          <w:numId w:val="1"/>
+        </w:numPr>
+      </w:pPr>
+      <w:r>
+        <w:t xml:space="preserve">imputing values below detection;</w:t>
+      </w:r>
+    </w:p>
+    <w:p>
+      <w:pPr>
+        <w:pStyle w:val="ListBullet"/>
+        <w:numPr>
+          <w:ilvl w:val="0"/>
+          <w:numId w:val="1"/>
+        </w:numPr>
+      </w:pPr>
+      <w:r>
+        <w:t xml:space="preserve">a tolerance in the bracket test;</w:t>
+      </w:r>
+    </w:p>
+    <w:p>
+      <w:pPr>
+        <w:pStyle w:val="ListBullet"/>
+        <w:numPr>
+          <w:ilvl w:val="0"/>
+          <w:numId w:val="1"/>
+        </w:numPr>
+      </w:pPr>
+      <w:r>
+        <w:t xml:space="preserve">the confusion matrix and DFA weighting factors;</w:t>
+      </w:r>
+    </w:p>
+    <w:p>
+      <w:pPr>
+        <w:pStyle w:val="ListBullet"/>
+        <w:numPr>
+          <w:ilvl w:val="0"/>
+          <w:numId w:val="1"/>
+        </w:numPr>
+      </w:pPr>
+      <w:r>
+        <w:t xml:space="preserve">keeping stable isotopes out of the organic matter correction.</w:t>
+      </w:r>
+    </w:p>
+    <w:p>
+      <w:pPr/>
+      <w:r>
+        <w:t xml:space="preserve">I would welcome your view on which of these SedSAT3 should have.</w:t>
       </w:r>
     </w:p>
     <w:p>
@@ -2037,7 +2090,7 @@
         <w:t xml:space="preserve">Status: </w:t>
       </w:r>
       <w:r>
-        <w:t xml:space="preserve">Table added; comparison to be filled in.</w:t>
+        <w:t xml:space="preserve">Done; for your review.</w:t>
       </w:r>
     </w:p>
     <w:p>
@@ -6125,7 +6178,7 @@
               <w:pStyle w:val="TableText"/>
             </w:pPr>
             <w:r>
-              <w:t xml:space="preserve">Last column of Table 1.1 in the manual.</w:t>
+              <w:t xml:space="preserve">Review the last column of Table 1.1, and say which Sed_SAT 1.0 features SedSAT3 should have.</w:t>
             </w:r>
           </w:p>
         </w:tc>

</xml_diff>

<commit_message>
Do not correct isotopes for organic matter and size by default
After the organic matter and size regressions, isotopes are not selected for
correction, whatever their p-values: delta values depend on the relative
proportions of organic matter, so a correction would bias them. Sed_SAT 1.0
kept them out of the organic content correction for the same reason. The
user can still select them in Settings > Organic Matter and Size Correction.

The manual, Table 1.1 and the response to the domain review say so.
Regression results are unchanged. Unit test
omSizeCorrection_isotopesNotCorrectedByDefault.

Co-Authored-By: Claude Opus 5.5 <noreply@anthropic.com>
</commit_message>
<xml_diff>
--- a/docs/review/response-domain-review/SedSAT3_domain_review_response.docx
+++ b/docs/review/response-domain-review/SedSAT3_domain_review_response.docx
@@ -2024,7 +2024,7 @@
     <w:p>
       <w:pPr/>
       <w:r>
-        <w:t xml:space="preserve">The comparison shows four things Sed_SAT 1.0 did that SedSAT3 does not:</w:t>
+        <w:t xml:space="preserve">The comparison showed that Sed_SAT 1.0 kept stable isotopes out of the organic matter correction, to avoid biasing them. SedSAT3 now does the same by default (the user can still choose to correct them). It also shows three things Sed_SAT 1.0 did that SedSAT3 does not:</w:t>
       </w:r>
     </w:p>
     <w:p>
@@ -2060,19 +2060,7 @@
         </w:numPr>
       </w:pPr>
       <w:r>
-        <w:t xml:space="preserve">the confusion matrix and DFA weighting factors;</w:t>
-      </w:r>
-    </w:p>
-    <w:p>
-      <w:pPr>
-        <w:pStyle w:val="ListBullet"/>
-        <w:numPr>
-          <w:ilvl w:val="0"/>
-          <w:numId w:val="1"/>
-        </w:numPr>
-      </w:pPr>
-      <w:r>
-        <w:t xml:space="preserve">keeping stable isotopes out of the organic matter correction.</w:t>
+        <w:t xml:space="preserve">the confusion matrix and DFA weighting factors.</w:t>
       </w:r>
     </w:p>
     <w:p>

</xml_diff>

<commit_message>
Add a leave-one-out confusion matrix to step 4
Step 4 (stepwise multi-way DFA) has a seventh panel: the confusion matrix of
the source samples for the selected constituents. It uses linear discriminant
classification with equal priors and leave-one-out cross-validation, as in
Sed_SAT 1.0 (MASS::lda with CV = TRUE). Each sample in turn is left out, and
the group means and pooled within-group covariance are computed without it;
the sample goes to the group with the smallest Mahalanobis distance. Rows are
the true groups, columns the groups assigned, and the last column the
percentage classified correctly. On tests/data/properties.cmb it matches an
independent numpy calculation cell for cell.

The manual describes the panel and how to read it, with a figure from the
example data; Table 1.1 and the response to the domain review are updated.
Unit test dfaConfusionMatrix.

Co-Authored-By: Claude Opus 5.5 <noreply@anthropic.com>
</commit_message>
<xml_diff>
--- a/docs/review/response-domain-review/SedSAT3_domain_review_response.docx
+++ b/docs/review/response-domain-review/SedSAT3_domain_review_response.docx
@@ -85,7 +85,7 @@
         <w:pStyle w:val="Line"/>
       </w:pPr>
       <w:r>
-        <w:t xml:space="preserve">October 22, 2026</w:t>
+        <w:t xml:space="preserve">October 23, 2026</w:t>
       </w:r>
     </w:p>
     <w:p>
@@ -2024,7 +2024,7 @@
     <w:p>
       <w:pPr/>
       <w:r>
-        <w:t xml:space="preserve">The comparison showed that Sed_SAT 1.0 kept stable isotopes out of the organic matter correction, to avoid biasing them. SedSAT3 now does the same by default (the user can still choose to correct them). It also shows three things Sed_SAT 1.0 did that SedSAT3 does not:</w:t>
+        <w:t xml:space="preserve">The comparison prompted two changes. SedSAT3 no longer corrects stable isotopes for organic matter and size by default, as in Sed_SAT 1.0, which avoided biasing them (the user can still choose to correct them). Step 4 has a confusion matrix (Comment 7.12). Sed_SAT 1.0 also did three things that SedSAT3 does not:</w:t>
       </w:r>
     </w:p>
     <w:p>
@@ -2060,7 +2060,7 @@
         </w:numPr>
       </w:pPr>
       <w:r>
-        <w:t xml:space="preserve">the confusion matrix and DFA weighting factors.</w:t>
+        <w:t xml:space="preserve">using tracer weighting factors from the DFA in the mixing model.</w:t>
       </w:r>
     </w:p>
     <w:p>
@@ -4339,14 +4339,13 @@
         <w:t xml:space="preserve">Response. </w:t>
       </w:r>
       <w:r>
-        <w:t xml:space="preserve">Yes. Source Verification does this: it treats each source sample as a target and shows which groups it is attributed to. The manual now presents it in that light (Section 5.4.2). A summary confusion matrix from the DFA is a good addition. </w:t>
-      </w:r>
-      <w:r>
-        <w:rPr>
-          <w:b/>
-          <w:color w:val="1446AA"/>
-        </w:rPr>
-        <w:t xml:space="preserve">[Arash: add a confusion matrix (DFA classification of the source samples) to step 4.]</w:t>
+        <w:t xml:space="preserve">Yes, and step 4 now has one: a seventh panel with the leave-one-out confusion matrix of the source samples for the selected constituents. It uses linear discriminant classification with equal priors, as in Sed_SAT 1.0. Each row is a true source group, each column the group assigned, and the last column the percentage classified correctly. I checked it against an independent calculation. In the example, most misclassifications are between Crop and Pasture. The manual describes it and how to read it (Section 3.5).</w:t>
+      </w:r>
+    </w:p>
+    <w:p>
+      <w:pPr/>
+      <w:r>
+        <w:t xml:space="preserve">Source Verification answers the same question with the fingerprinting itself, and the manual now relates the two.</w:t>
       </w:r>
     </w:p>
     <w:p>
@@ -4358,7 +4357,7 @@
         <w:t xml:space="preserve">Status: </w:t>
       </w:r>
       <w:r>
-        <w:t xml:space="preserve">Documented; addition planned.</w:t>
+        <w:t xml:space="preserve">Done.</w:t>
       </w:r>
     </w:p>
     <w:p>
@@ -5919,9 +5918,9 @@
         </w:tblCellMar>
       </w:tblPr>
       <w:tblGrid>
-        <w:gridCol w:w="3536"/>
-        <w:gridCol w:w="970"/>
-        <w:gridCol w:w="4854"/>
+        <w:gridCol w:w="3358"/>
+        <w:gridCol w:w="1000"/>
+        <w:gridCol w:w="5002"/>
       </w:tblGrid>
       <w:tr>
         <w:trPr>
@@ -5929,7 +5928,7 @@
         </w:trPr>
         <w:tc>
           <w:tcPr>
-            <w:tcW w:w="3536" w:type="dxa"/>
+            <w:tcW w:w="3358" w:type="dxa"/>
             <w:shd w:val="clear" w:color="auto" w:fill="E6EFEA"/>
           </w:tcPr>
           <w:p>
@@ -5946,7 +5945,7 @@
         </w:tc>
         <w:tc>
           <w:tcPr>
-            <w:tcW w:w="970" w:type="dxa"/>
+            <w:tcW w:w="1000" w:type="dxa"/>
             <w:shd w:val="clear" w:color="auto" w:fill="E6EFEA"/>
           </w:tcPr>
           <w:p>
@@ -5963,7 +5962,7 @@
         </w:tc>
         <w:tc>
           <w:tcPr>
-            <w:tcW w:w="4854" w:type="dxa"/>
+            <w:tcW w:w="5002" w:type="dxa"/>
             <w:shd w:val="clear" w:color="auto" w:fill="E6EFEA"/>
           </w:tcPr>
           <w:p>
@@ -5985,7 +5984,7 @@
         </w:trPr>
         <w:tc>
           <w:tcPr>
-            <w:tcW w:w="3536" w:type="dxa"/>
+            <w:tcW w:w="3358" w:type="dxa"/>
           </w:tcPr>
           <w:p>
             <w:pPr>
@@ -5998,7 +5997,7 @@
         </w:tc>
         <w:tc>
           <w:tcPr>
-            <w:tcW w:w="970" w:type="dxa"/>
+            <w:tcW w:w="1000" w:type="dxa"/>
           </w:tcPr>
           <w:p>
             <w:pPr>
@@ -6015,7 +6014,7 @@
         </w:tc>
         <w:tc>
           <w:tcPr>
-            <w:tcW w:w="4854" w:type="dxa"/>
+            <w:tcW w:w="5002" w:type="dxa"/>
           </w:tcPr>
           <w:p>
             <w:pPr>
@@ -6033,7 +6032,7 @@
         </w:trPr>
         <w:tc>
           <w:tcPr>
-            <w:tcW w:w="3536" w:type="dxa"/>
+            <w:tcW w:w="3358" w:type="dxa"/>
           </w:tcPr>
           <w:p>
             <w:pPr>
@@ -6046,7 +6045,7 @@
         </w:tc>
         <w:tc>
           <w:tcPr>
-            <w:tcW w:w="970" w:type="dxa"/>
+            <w:tcW w:w="1000" w:type="dxa"/>
           </w:tcPr>
           <w:p>
             <w:pPr>
@@ -6063,7 +6062,7 @@
         </w:tc>
         <w:tc>
           <w:tcPr>
-            <w:tcW w:w="4854" w:type="dxa"/>
+            <w:tcW w:w="5002" w:type="dxa"/>
           </w:tcPr>
           <w:p>
             <w:pPr>
@@ -6081,7 +6080,7 @@
         </w:trPr>
         <w:tc>
           <w:tcPr>
-            <w:tcW w:w="3536" w:type="dxa"/>
+            <w:tcW w:w="3358" w:type="dxa"/>
           </w:tcPr>
           <w:p>
             <w:pPr>
@@ -6094,7 +6093,7 @@
         </w:tc>
         <w:tc>
           <w:tcPr>
-            <w:tcW w:w="970" w:type="dxa"/>
+            <w:tcW w:w="1000" w:type="dxa"/>
           </w:tcPr>
           <w:p>
             <w:pPr>
@@ -6111,7 +6110,7 @@
         </w:tc>
         <w:tc>
           <w:tcPr>
-            <w:tcW w:w="4854" w:type="dxa"/>
+            <w:tcW w:w="5002" w:type="dxa"/>
           </w:tcPr>
           <w:p>
             <w:pPr>
@@ -6129,7 +6128,7 @@
         </w:trPr>
         <w:tc>
           <w:tcPr>
-            <w:tcW w:w="3536" w:type="dxa"/>
+            <w:tcW w:w="3358" w:type="dxa"/>
           </w:tcPr>
           <w:p>
             <w:pPr>
@@ -6142,7 +6141,7 @@
         </w:tc>
         <w:tc>
           <w:tcPr>
-            <w:tcW w:w="970" w:type="dxa"/>
+            <w:tcW w:w="1000" w:type="dxa"/>
           </w:tcPr>
           <w:p>
             <w:pPr>
@@ -6159,7 +6158,7 @@
         </w:tc>
         <w:tc>
           <w:tcPr>
-            <w:tcW w:w="4854" w:type="dxa"/>
+            <w:tcW w:w="5002" w:type="dxa"/>
           </w:tcPr>
           <w:p>
             <w:pPr>
@@ -6177,7 +6176,7 @@
         </w:trPr>
         <w:tc>
           <w:tcPr>
-            <w:tcW w:w="3536" w:type="dxa"/>
+            <w:tcW w:w="3358" w:type="dxa"/>
           </w:tcPr>
           <w:p>
             <w:pPr>
@@ -6190,7 +6189,7 @@
         </w:tc>
         <w:tc>
           <w:tcPr>
-            <w:tcW w:w="970" w:type="dxa"/>
+            <w:tcW w:w="1000" w:type="dxa"/>
           </w:tcPr>
           <w:p>
             <w:pPr>
@@ -6207,7 +6206,7 @@
         </w:tc>
         <w:tc>
           <w:tcPr>
-            <w:tcW w:w="4854" w:type="dxa"/>
+            <w:tcW w:w="5002" w:type="dxa"/>
           </w:tcPr>
           <w:p>
             <w:pPr>
@@ -6225,7 +6224,7 @@
         </w:trPr>
         <w:tc>
           <w:tcPr>
-            <w:tcW w:w="3536" w:type="dxa"/>
+            <w:tcW w:w="3358" w:type="dxa"/>
           </w:tcPr>
           <w:p>
             <w:pPr>
@@ -6238,7 +6237,7 @@
         </w:tc>
         <w:tc>
           <w:tcPr>
-            <w:tcW w:w="970" w:type="dxa"/>
+            <w:tcW w:w="1000" w:type="dxa"/>
           </w:tcPr>
           <w:p>
             <w:pPr>
@@ -6255,7 +6254,7 @@
         </w:tc>
         <w:tc>
           <w:tcPr>
-            <w:tcW w:w="4854" w:type="dxa"/>
+            <w:tcW w:w="5002" w:type="dxa"/>
           </w:tcPr>
           <w:p>
             <w:pPr>
@@ -6273,7 +6272,7 @@
         </w:trPr>
         <w:tc>
           <w:tcPr>
-            <w:tcW w:w="3536" w:type="dxa"/>
+            <w:tcW w:w="3358" w:type="dxa"/>
           </w:tcPr>
           <w:p>
             <w:pPr>
@@ -6286,7 +6285,7 @@
         </w:tc>
         <w:tc>
           <w:tcPr>
-            <w:tcW w:w="970" w:type="dxa"/>
+            <w:tcW w:w="1000" w:type="dxa"/>
           </w:tcPr>
           <w:p>
             <w:pPr>
@@ -6303,7 +6302,7 @@
         </w:tc>
         <w:tc>
           <w:tcPr>
-            <w:tcW w:w="4854" w:type="dxa"/>
+            <w:tcW w:w="5002" w:type="dxa"/>
           </w:tcPr>
           <w:p>
             <w:pPr>
@@ -6321,7 +6320,7 @@
         </w:trPr>
         <w:tc>
           <w:tcPr>
-            <w:tcW w:w="3536" w:type="dxa"/>
+            <w:tcW w:w="3358" w:type="dxa"/>
           </w:tcPr>
           <w:p>
             <w:pPr>
@@ -6334,7 +6333,7 @@
         </w:tc>
         <w:tc>
           <w:tcPr>
-            <w:tcW w:w="970" w:type="dxa"/>
+            <w:tcW w:w="1000" w:type="dxa"/>
           </w:tcPr>
           <w:p>
             <w:pPr>
@@ -6351,7 +6350,7 @@
         </w:tc>
         <w:tc>
           <w:tcPr>
-            <w:tcW w:w="4854" w:type="dxa"/>
+            <w:tcW w:w="5002" w:type="dxa"/>
           </w:tcPr>
           <w:p>
             <w:pPr>
@@ -6369,20 +6368,20 @@
         </w:trPr>
         <w:tc>
           <w:tcPr>
-            <w:tcW w:w="3536" w:type="dxa"/>
+            <w:tcW w:w="3358" w:type="dxa"/>
           </w:tcPr>
           <w:p>
             <w:pPr>
               <w:pStyle w:val="TableText"/>
             </w:pPr>
             <w:r>
-              <w:t xml:space="preserve">Notes column; confusion matrix; target sheet dialog</w:t>
+              <w:t xml:space="preserve">Notes column; target sheet dialog</w:t>
             </w:r>
           </w:p>
         </w:tc>
         <w:tc>
           <w:tcPr>
-            <w:tcW w:w="970" w:type="dxa"/>
+            <w:tcW w:w="1000" w:type="dxa"/>
           </w:tcPr>
           <w:p>
             <w:pPr>
@@ -6399,7 +6398,7 @@
         </w:tc>
         <w:tc>
           <w:tcPr>
-            <w:tcW w:w="4854" w:type="dxa"/>
+            <w:tcW w:w="5002" w:type="dxa"/>
           </w:tcPr>
           <w:p>
             <w:pPr>

</xml_diff>

<commit_message>
Turn Dissolve Chains off by default
Replacing poor chains with copies of better ones made the worst-mixing
parameters worse in every case compared (Table 4.1 of the manual: at
400,000 samples, smallest ESS 55 with it against 428 without). It still
speeds up the start of a run, so it stays available. The two Bayesian forms
default to unchecked; the manual, the tool descriptions and the response to
the domain review say so, and the Bayesian figures are regenerated with the
new default.

Co-Authored-By: Claude Opus 5.5 <noreply@anthropic.com>
</commit_message>
<xml_diff>
--- a/docs/review/response-domain-review/SedSAT3_domain_review_response.docx
+++ b/docs/review/response-domain-review/SedSAT3_domain_review_response.docx
@@ -4614,7 +4614,16 @@
         <w:t xml:space="preserve">Dissolve Chains</w:t>
       </w:r>
       <w:r>
-        <w:t xml:space="preserve"> unchecked, every parameter meets both criteria (\hat{R} \le 1.017, at least 428 effective samples). The manual gives the comparison (Section 4.1.1, Table 4.1) and the advice for final results.</w:t>
+        <w:t xml:space="preserve"> unchecked, every parameter meets both criteria (\hat{R} \le 1.017, at least 428 effective samples). Because </w:t>
+      </w:r>
+      <w:r>
+        <w:rPr>
+          <w:i/>
+        </w:rPr>
+        <w:t xml:space="preserve">Dissolve Chains</w:t>
+      </w:r>
+      <w:r>
+        <w:t xml:space="preserve"> made the worst-mixing parameters worse in every case, it is now unchecked by default. The manual gives the comparison (Section 4.1.1, Table 4.1) and the advice for final results.</w:t>
       </w:r>
     </w:p>
     <w:p>

</xml_diff>

<commit_message>
Domain review response: decisions instead of questions to the reviewer
- Constituent order: keep alphabetical, with the reasons (the project
  stores constituents by name, one order for every result, comparable
  runs; CSV export to reorder). Closed. Manual says why.
- Sed_SAT 1.0 features: below-detection imputation and DFA weights not
  added, with reasons; bracket test tolerance planned for the next release.
- No requests to the reviewer remain; Allen still reviews Table 1.1.
- Response PDF/docx and manual PDF rebuilt.

Co-Authored-By: Claude Opus 5.5 <noreply@anthropic.com>
</commit_message>
<xml_diff>
--- a/docs/review/response-domain-review/SedSAT3_domain_review_response.docx
+++ b/docs/review/response-domain-review/SedSAT3_domain_review_response.docx
@@ -1999,7 +1999,7 @@
         <w:t xml:space="preserve">Response. </w:t>
       </w:r>
       <w:r>
-        <w:t xml:space="preserve">Added Table 1.1, “Methods in SedSAT3” (Section 1.2). For each method it gives SedSAT3’s approach, where the manual describes it, and how it compares with Sed_SAT 1.0: the same, changed, new, or not in SedSAT3. I wrote the comparison from the Sed_SAT 1.0 source code (the software release, doi:10.5066/F76Q1VBX) and its report. Please check it, since you know Sed_SAT 1.0 best.</w:t>
+        <w:t xml:space="preserve">Added Table 1.1, “Methods in SedSAT3” (Section 1.2). For each method it gives SedSAT3’s approach, where the manual describes it, and how it compares with Sed_SAT 1.0: the same, changed, new, or not in SedSAT3. I wrote the comparison from the Sed_SAT 1.0 source code (the software release, doi:10.5066/F76Q1VBX) and its report.</w:t>
       </w:r>
     </w:p>
     <w:p>
@@ -2047,7 +2047,61 @@
     <w:p>
       <w:pPr/>
       <w:r>
-        <w:t xml:space="preserve">I would welcome your view on which of these SedSAT3 should have.</w:t>
+        <w:t xml:space="preserve">We decided as follows:</w:t>
+      </w:r>
+    </w:p>
+    <w:p>
+      <w:pPr>
+        <w:pStyle w:val="ListBullet"/>
+        <w:numPr>
+          <w:ilvl w:val="0"/>
+          <w:numId w:val="1"/>
+        </w:numPr>
+      </w:pPr>
+      <w:r>
+        <w:rPr>
+          <w:b/>
+        </w:rPr>
+        <w:t xml:space="preserve">Values below detection:</w:t>
+      </w:r>
+      <w:r>
+        <w:t xml:space="preserve"> not added. The substitution for a non-detect depends on the laboratory and the method, so it is the analyst’s choice; the user replaces these values before import, as the manual explains (Chapter 2).</w:t>
+      </w:r>
+    </w:p>
+    <w:p>
+      <w:pPr>
+        <w:pStyle w:val="ListBullet"/>
+        <w:numPr>
+          <w:ilvl w:val="0"/>
+          <w:numId w:val="1"/>
+        </w:numPr>
+      </w:pPr>
+      <w:r>
+        <w:rPr>
+          <w:b/>
+        </w:rPr>
+        <w:t xml:space="preserve">Bracket test tolerance:</w:t>
+      </w:r>
+      <w:r>
+        <w:t xml:space="preserve"> planned for the next release, as an option that widens the source range by a percentage, with a default of 0 so that results do not change unless it is chosen.</w:t>
+      </w:r>
+    </w:p>
+    <w:p>
+      <w:pPr>
+        <w:pStyle w:val="ListBullet"/>
+        <w:numPr>
+          <w:ilvl w:val="0"/>
+          <w:numId w:val="1"/>
+        </w:numPr>
+      </w:pPr>
+      <w:r>
+        <w:rPr>
+          <w:b/>
+        </w:rPr>
+        <w:t xml:space="preserve">DFA weighting factors:</w:t>
+      </w:r>
+      <w:r>
+        <w:t xml:space="preserve"> not added. The Bayesian model already estimates an error standard deviation for each constituent, which weights the constituents by how well the mixing model reproduces them. Weights from the DFA would favor the tracers that separate the sources best, not those that behave conservatively.</w:t>
       </w:r>
     </w:p>
     <w:p>
@@ -2059,7 +2113,7 @@
         <w:t xml:space="preserve">Status: </w:t>
       </w:r>
       <w:r>
-        <w:t xml:space="preserve">Done; for your review.</w:t>
+        <w:t xml:space="preserve">Done.</w:t>
       </w:r>
     </w:p>
     <w:p>
@@ -2185,7 +2239,7 @@
         <w:t xml:space="preserve">Response. </w:t>
       </w:r>
       <w:r>
-        <w:t xml:space="preserve">The title page now gives the software version, 1.1.8, and the date as a placeholder until publication. The manual now also has a list of figures after the table of contents. </w:t>
+        <w:t xml:space="preserve">The title page now gives the software version, 1.1.8, and the date as a placeholder until publication. The manual now also has a list of figures after the table of contents, which covers the “missing” item; the PDF has a full table of contents. </w:t>
       </w:r>
       <w:r>
         <w:rPr>
@@ -2193,9 +2247,6 @@
           <w:color w:val="BE1E1E"/>
         </w:rPr>
         <w:t xml:space="preserve">[Cara: confirm the version number and set the publication date.]</w:t>
-      </w:r>
-      <w:r>
-        <w:t xml:space="preserve"> I was not sure what “missing” at the table of contents referred to: the list of figures, or a table of contents absent from the Word copy (the PDF has one). Please tell me if it is something else.</w:t>
       </w:r>
     </w:p>
     <w:p>
@@ -2771,14 +2822,7 @@
         <w:t xml:space="preserve">Response. </w:t>
       </w:r>
       <w:r>
-        <w:t xml:space="preserve">Agreed. The program stores the constituents in a structure sorted by name, so the alphabetical order appears in every table and result. Keeping the file’s order touches the project file format and every result. I would rather make that change separately, with its own tests, than in this review. The manual now states that constituents are listed alphabetically. </w:t>
-      </w:r>
-      <w:r>
-        <w:rPr>
-          <w:b/>
-          <w:color w:val="1446AA"/>
-        </w:rPr>
-        <w:t xml:space="preserve">[Arash: keep the Excel column order (project format and results); planned separately.]</w:t>
+        <w:t xml:space="preserve">We considered this and decided to keep the alphabetical order. The project file stores the constituents by name, with no column order, so a saved project and every result use one order that does not depend on how a spreadsheet was arranged: two datasets with the same constituents give their results in the same order, which makes runs, projects and the command-line tool’s output directly comparable. With 24 constituents in the example data, an alphabetical list is also the quickest to search. Where the order carries meaning, the tools use their own: the stepwise DFA lists the constituents in the order they entered. Every result table can be exported to CSV and reordered in a spreadsheet if another order is wanted. The manual now states that constituents are listed alphabetically, and why.</w:t>
       </w:r>
     </w:p>
     <w:p>
@@ -2790,7 +2834,7 @@
         <w:t xml:space="preserve">Status: </w:t>
       </w:r>
       <w:r>
-        <w:t xml:space="preserve">Documented; change planned.</w:t>
+        <w:t xml:space="preserve">Closed: alphabetical order kept.</w:t>
       </w:r>
     </w:p>
     <w:p>
@@ -5816,9 +5860,9 @@
         </w:tblCellMar>
       </w:tblPr>
       <w:tblGrid>
-        <w:gridCol w:w="3358"/>
-        <w:gridCol w:w="1000"/>
-        <w:gridCol w:w="5002"/>
+        <w:gridCol w:w="3384"/>
+        <w:gridCol w:w="936"/>
+        <w:gridCol w:w="5040"/>
       </w:tblGrid>
       <w:tr>
         <w:trPr>
@@ -5826,7 +5870,7 @@
         </w:trPr>
         <w:tc>
           <w:tcPr>
-            <w:tcW w:w="3358" w:type="dxa"/>
+            <w:tcW w:w="3384" w:type="dxa"/>
             <w:shd w:val="clear" w:color="auto" w:fill="E6EFEA"/>
           </w:tcPr>
           <w:p>
@@ -5843,7 +5887,7 @@
         </w:tc>
         <w:tc>
           <w:tcPr>
-            <w:tcW w:w="1000" w:type="dxa"/>
+            <w:tcW w:w="936" w:type="dxa"/>
             <w:shd w:val="clear" w:color="auto" w:fill="E6EFEA"/>
           </w:tcPr>
           <w:p>
@@ -5860,7 +5904,7 @@
         </w:tc>
         <w:tc>
           <w:tcPr>
-            <w:tcW w:w="5002" w:type="dxa"/>
+            <w:tcW w:w="5040" w:type="dxa"/>
             <w:shd w:val="clear" w:color="auto" w:fill="E6EFEA"/>
           </w:tcPr>
           <w:p>
@@ -5882,7 +5926,7 @@
         </w:trPr>
         <w:tc>
           <w:tcPr>
-            <w:tcW w:w="3358" w:type="dxa"/>
+            <w:tcW w:w="3384" w:type="dxa"/>
           </w:tcPr>
           <w:p>
             <w:pPr>
@@ -5895,7 +5939,7 @@
         </w:tc>
         <w:tc>
           <w:tcPr>
-            <w:tcW w:w="1000" w:type="dxa"/>
+            <w:tcW w:w="936" w:type="dxa"/>
           </w:tcPr>
           <w:p>
             <w:pPr>
@@ -5912,7 +5956,7 @@
         </w:tc>
         <w:tc>
           <w:tcPr>
-            <w:tcW w:w="5002" w:type="dxa"/>
+            <w:tcW w:w="5040" w:type="dxa"/>
           </w:tcPr>
           <w:p>
             <w:pPr>
@@ -5930,7 +5974,7 @@
         </w:trPr>
         <w:tc>
           <w:tcPr>
-            <w:tcW w:w="3358" w:type="dxa"/>
+            <w:tcW w:w="3384" w:type="dxa"/>
           </w:tcPr>
           <w:p>
             <w:pPr>
@@ -5943,7 +5987,7 @@
         </w:tc>
         <w:tc>
           <w:tcPr>
-            <w:tcW w:w="1000" w:type="dxa"/>
+            <w:tcW w:w="936" w:type="dxa"/>
           </w:tcPr>
           <w:p>
             <w:pPr>
@@ -5960,7 +6004,7 @@
         </w:tc>
         <w:tc>
           <w:tcPr>
-            <w:tcW w:w="5002" w:type="dxa"/>
+            <w:tcW w:w="5040" w:type="dxa"/>
           </w:tcPr>
           <w:p>
             <w:pPr>
@@ -5978,7 +6022,7 @@
         </w:trPr>
         <w:tc>
           <w:tcPr>
-            <w:tcW w:w="3358" w:type="dxa"/>
+            <w:tcW w:w="3384" w:type="dxa"/>
           </w:tcPr>
           <w:p>
             <w:pPr>
@@ -5991,7 +6035,7 @@
         </w:tc>
         <w:tc>
           <w:tcPr>
-            <w:tcW w:w="1000" w:type="dxa"/>
+            <w:tcW w:w="936" w:type="dxa"/>
           </w:tcPr>
           <w:p>
             <w:pPr>
@@ -6008,7 +6052,7 @@
         </w:tc>
         <w:tc>
           <w:tcPr>
-            <w:tcW w:w="5002" w:type="dxa"/>
+            <w:tcW w:w="5040" w:type="dxa"/>
           </w:tcPr>
           <w:p>
             <w:pPr>
@@ -6026,7 +6070,7 @@
         </w:trPr>
         <w:tc>
           <w:tcPr>
-            <w:tcW w:w="3358" w:type="dxa"/>
+            <w:tcW w:w="3384" w:type="dxa"/>
           </w:tcPr>
           <w:p>
             <w:pPr>
@@ -6039,7 +6083,7 @@
         </w:tc>
         <w:tc>
           <w:tcPr>
-            <w:tcW w:w="1000" w:type="dxa"/>
+            <w:tcW w:w="936" w:type="dxa"/>
           </w:tcPr>
           <w:p>
             <w:pPr>
@@ -6050,20 +6094,20 @@
                 <w:b/>
                 <w:color w:val="BE1E1E"/>
               </w:rPr>
-              <w:t xml:space="preserve">[Allen, Lilly]</w:t>
+              <w:t xml:space="preserve">[Allen]</w:t>
             </w:r>
           </w:p>
         </w:tc>
         <w:tc>
           <w:tcPr>
-            <w:tcW w:w="5002" w:type="dxa"/>
+            <w:tcW w:w="5040" w:type="dxa"/>
           </w:tcPr>
           <w:p>
             <w:pPr>
               <w:pStyle w:val="TableText"/>
             </w:pPr>
             <w:r>
-              <w:t xml:space="preserve">Review the last column of Table 1.1, and say which Sed_SAT 1.0 features SedSAT3 should have.</w:t>
+              <w:t xml:space="preserve">Review the last column of Table 1.1.</w:t>
             </w:r>
           </w:p>
         </w:tc>
@@ -6074,7 +6118,7 @@
         </w:trPr>
         <w:tc>
           <w:tcPr>
-            <w:tcW w:w="3358" w:type="dxa"/>
+            <w:tcW w:w="3384" w:type="dxa"/>
           </w:tcPr>
           <w:p>
             <w:pPr>
@@ -6087,7 +6131,7 @@
         </w:tc>
         <w:tc>
           <w:tcPr>
-            <w:tcW w:w="1000" w:type="dxa"/>
+            <w:tcW w:w="936" w:type="dxa"/>
           </w:tcPr>
           <w:p>
             <w:pPr>
@@ -6104,7 +6148,7 @@
         </w:tc>
         <w:tc>
           <w:tcPr>
-            <w:tcW w:w="5002" w:type="dxa"/>
+            <w:tcW w:w="5040" w:type="dxa"/>
           </w:tcPr>
           <w:p>
             <w:pPr>
@@ -6122,44 +6166,40 @@
         </w:trPr>
         <w:tc>
           <w:tcPr>
-            <w:tcW w:w="3358" w:type="dxa"/>
+            <w:tcW w:w="3384" w:type="dxa"/>
           </w:tcPr>
           <w:p>
             <w:pPr>
               <w:pStyle w:val="TableText"/>
             </w:pPr>
             <w:r>
-              <w:t xml:space="preserve">Constituent order</w:t>
+              <w:t xml:space="preserve">Bracket test tolerance</w:t>
             </w:r>
           </w:p>
         </w:tc>
         <w:tc>
           <w:tcPr>
-            <w:tcW w:w="1000" w:type="dxa"/>
+            <w:tcW w:w="936" w:type="dxa"/>
           </w:tcPr>
           <w:p>
             <w:pPr>
               <w:pStyle w:val="TableText"/>
             </w:pPr>
             <w:r>
-              <w:rPr>
-                <w:b/>
-                <w:color w:val="1446AA"/>
-              </w:rPr>
-              <w:t xml:space="preserve">[Arash: Arash]</w:t>
+              <w:t xml:space="preserve">Next release</w:t>
             </w:r>
           </w:p>
         </w:tc>
         <w:tc>
           <w:tcPr>
-            <w:tcW w:w="5002" w:type="dxa"/>
+            <w:tcW w:w="5040" w:type="dxa"/>
           </w:tcPr>
           <w:p>
             <w:pPr>
               <w:pStyle w:val="TableText"/>
             </w:pPr>
             <w:r>
-              <w:t xml:space="preserve">Keep the Excel column order; planned separately.</w:t>
+              <w:t xml:space="preserve">An option to widen the source range, default 0.</w:t>
             </w:r>
           </w:p>
         </w:tc>

</xml_diff>

<commit_message>
Remove the genetic algorithm from the user's manual
The genetic algorithm is not part of this release, so its section (and
its two figures) is removed from the manual rather than kept with a "not
in this release" note, and the theory chapter no longer mentions it. The
domain review response says so, and the open-items table no longer asks
Cara and Allen to decide. The GA code stays, excluded from the build by
default. Manual PDF (MiKTeX, with bibtex) and the response's PDF and .docx
regenerated.

Co-Authored-By: Claude Opus 5.5 <noreply@anthropic.com>
</commit_message>
<xml_diff>
--- a/docs/review/response-domain-review/SedSAT3_domain_review_response.docx
+++ b/docs/review/response-domain-review/SedSAT3_domain_review_response.docx
@@ -5769,14 +5769,7 @@
         <w:t xml:space="preserve">Response. </w:t>
       </w:r>
       <w:r>
-        <w:t xml:space="preserve">The genetic algorithm is not part of this release: Levenberg–Marquardt solves the same problem more efficiently, and the GA is only in an optional build. The section now says so at its start. On the hidden modeled points: in all modeled-vs-observed plots, the later series is now drawn smaller, so the modeled value shows as a ring around the observed one where they agree. </w:t>
-      </w:r>
-      <w:r>
-        <w:rPr>
-          <w:b/>
-          <w:color w:val="BE1E1E"/>
-        </w:rPr>
-        <w:t xml:space="preserve">[Allen, Cara: keep the GA section (marked as not in this release), or remove it from the manual?]</w:t>
+        <w:t xml:space="preserve">The genetic algorithm is not part of this release: Levenberg–Marquardt solves the same problem more efficiently, and the GA is only in an optional build. Its section is therefore removed from the manual. On the hidden modeled points: in all modeled-vs-observed plots, the later series is now drawn smaller, so the modeled value shows as a ring around the observed one where they agree.</w:t>
       </w:r>
     </w:p>
     <w:p>
@@ -5788,7 +5781,7 @@
         <w:t xml:space="preserve">Status: </w:t>
       </w:r>
       <w:r>
-        <w:t xml:space="preserve">Documented; plot fixed.</w:t>
+        <w:t xml:space="preserve">Section removed; plot fixed.</w:t>
       </w:r>
     </w:p>
     <w:p>
@@ -6131,54 +6124,6 @@
           </w:p>
         </w:tc>
       </w:tr>
-      <w:tr>
-        <w:trPr>
-          <w:cantSplit/>
-        </w:trPr>
-        <w:tc>
-          <w:tcPr>
-            <w:tcW w:w="3384" w:type="dxa"/>
-          </w:tcPr>
-          <w:p>
-            <w:pPr>
-              <w:pStyle w:val="TableText"/>
-            </w:pPr>
-            <w:r>
-              <w:t xml:space="preserve">Genetic algorithm section</w:t>
-            </w:r>
-          </w:p>
-        </w:tc>
-        <w:tc>
-          <w:tcPr>
-            <w:tcW w:w="936" w:type="dxa"/>
-          </w:tcPr>
-          <w:p>
-            <w:pPr>
-              <w:pStyle w:val="TableText"/>
-            </w:pPr>
-            <w:r>
-              <w:rPr>
-                <w:b/>
-                <w:color w:val="BE1E1E"/>
-              </w:rPr>
-              <w:t xml:space="preserve">[Allen, Cara]</w:t>
-            </w:r>
-          </w:p>
-        </w:tc>
-        <w:tc>
-          <w:tcPr>
-            <w:tcW w:w="5040" w:type="dxa"/>
-          </w:tcPr>
-          <w:p>
-            <w:pPr>
-              <w:pStyle w:val="TableText"/>
-            </w:pPr>
-            <w:r>
-              <w:t xml:space="preserve">Keep (marked as not in this release) or remove.</w:t>
-            </w:r>
-          </w:p>
-        </w:tc>
-      </w:tr>
     </w:tbl>
     <w:p>
       <w:pPr>

</xml_diff>

<commit_message>
Link the final 1.1.8 portable package from the domain review response
- Domain review response: "The version to test now", with the download
  link of the package posted on merge request !4 and its SHA-256.
- REVIEW_RESPONSE.md: the final package (built from 74d54a6, 44.4 MB),
  its checksum and link, and what its example runs.
- tex2docx.py: a literal backslash written as \textbackslash without
  braces (as \code{...} needs) was left as LaTeX, and one followed by S
  turned into a section sign. Backslashes now go through a placeholder
  until the other macros are replaced. The code review letter converts to
  the same text as before.
- The response's PDF (MiKTeX) and .docx regenerated.

Co-Authored-By: Claude Opus 5.5 <noreply@anthropic.com>
</commit_message>
<xml_diff>
--- a/docs/review/response-domain-review/SedSAT3_domain_review_response.docx
+++ b/docs/review/response-domain-review/SedSAT3_domain_review_response.docx
@@ -185,6 +185,76 @@
       </w:r>
       <w:r>
         <w:t xml:space="preserve"> and the manual commits.</w:t>
+      </w:r>
+    </w:p>
+    <w:p>
+      <w:pPr/>
+      <w:r>
+        <w:rPr>
+          <w:b/>
+        </w:rPr>
+        <w:t xml:space="preserve">The version to test now.</w:t>
+      </w:r>
+      <w:r>
+        <w:t xml:space="preserve"> The portable Windows package of version 1.1.8, built from this branch with every fix in this letter, can be downloaded from code.usgs.gov (sign in first):</w:t>
+      </w:r>
+      <w:r>
+        <w:br/>
+      </w:r>
+      <w:r>
+        <w:t xml:space="preserve"> </w:t>
+      </w:r>
+      <w:r>
+        <w:t xml:space="preserve">https://code.usgs.gov/-/project/20102/uploads/a9642eb7c4f46c966d73c3225341d418/SedSAT3-1.1.8-windows-x64-portable.zip</w:t>
+      </w:r>
+      <w:r>
+        <w:br/>
+      </w:r>
+      <w:r>
+        <w:t xml:space="preserve"> SHA-256: </w:t>
+      </w:r>
+      <w:r>
+        <w:rPr>
+          <w:rFonts w:ascii="Consolas" w:hAnsi="Consolas" w:cs="Consolas"/>
+          <w:sz w:val="19"/>
+        </w:rPr>
+        <w:t xml:space="preserve">0cd424f93650ed42d7888ba8863f803b9af9ab31ceee38ee407ab9afce6056b3</w:t>
+      </w:r>
+      <w:r>
+        <w:br/>
+      </w:r>
+      <w:r>
+        <w:t xml:space="preserve"> Unzip it and run </w:t>
+      </w:r>
+      <w:r>
+        <w:rPr>
+          <w:rFonts w:ascii="Consolas" w:hAnsi="Consolas" w:cs="Consolas"/>
+          <w:sz w:val="19"/>
+        </w:rPr>
+        <w:t xml:space="preserve">SedSat3.exe</w:t>
+      </w:r>
+      <w:r>
+        <w:t xml:space="preserve"> from its </w:t>
+      </w:r>
+      <w:r>
+        <w:rPr>
+          <w:rFonts w:ascii="Consolas" w:hAnsi="Consolas" w:cs="Consolas"/>
+          <w:sz w:val="19"/>
+        </w:rPr>
+        <w:t xml:space="preserve">bin\bin</w:t>
+      </w:r>
+      <w:r>
+        <w:t xml:space="preserve"> folder; it needs no installation and no administrator rights. It contains the command-line version, both manuals and the example data, and its </w:t>
+      </w:r>
+      <w:r>
+        <w:rPr>
+          <w:rFonts w:ascii="Consolas" w:hAnsi="Consolas" w:cs="Consolas"/>
+          <w:sz w:val="19"/>
+        </w:rPr>
+        <w:t xml:space="preserve">README-PORTABLE.txt</w:t>
+      </w:r>
+      <w:r>
+        <w:t xml:space="preserve"> explains how to run it and what results to expect.</w:t>
       </w:r>
     </w:p>
     <w:p>

</xml_diff>